<commit_message>
docs: correct Sprint 3 supervisor review date
</commit_message>
<xml_diff>
--- a/docs/meetings/sprint3_supervisor_review.docx
+++ b/docs/meetings/sprint3_supervisor_review.docx
@@ -46,7 +46,7 @@
           <w:sz w:val="20"/>
           <w:szCs w:val="20"/>
         </w:rPr>
-        <w:t>CSIT321 — Project 37 | Group 19 | University of Wollongong | 29 April 2026</w:t>
+        <w:t>CSIT321 — Project 37 | Group 19 | University of Wollongong | 1 May 2026</w:t>
       </w:r>
     </w:p>
     <w:p>
@@ -62,7 +62,7 @@
         <w:spacing w:before="60" w:after="60"/>
       </w:pPr>
       <w:r>
-        <w:t xml:space="preserve">Sprint 3 ran from 15 April to 28 April 2026. The primary goal was to build and demonstrate a working end-to-end Retrieval-Augmented Generation (RAG) pipeline on real course materials, even if rudimentary, while also producing the full set of design and documentation deliverables required for Assessment 2. This document summarises the outcomes of the Sprint 3 supervisor review meeting held with Prof. Jun Yan on 29 April 2026.</w:t>
+        <w:t xml:space="preserve">Sprint 3 ran from 15 April to 28 April 2026. The primary goal was to build and demonstrate a working end-to-end Retrieval-Augmented Generation (RAG) pipeline on real course materials, even if rudimentary, while also producing the full set of design and documentation deliverables required for Assessment 2. This document summarises the outcomes of the Sprint 3 supervisor review meeting held with Prof. Jun Yan on 1 May 2026.</w:t>
       </w:r>
     </w:p>
     <w:p>

</xml_diff>